<commit_message>
feat: Bow Design module, IACS anchor equipment, PDF section, 3358 formulas
</commit_message>
<xml_diff>
--- a/Improve the 3D hull viewport in Ship Builder.docx
+++ b/Improve the 3D hull viewport in Ship Builder.docx
@@ -7,161 +7,24 @@
         <w:pStyle w:val="NoSpacing"/>
       </w:pPr>
       <w:r>
-        <w:t>Improve the 3D hull viewport in Ship Builder:</w:t>
-      </w:r>
-    </w:p>
-    <w:p>
-      <w:pPr>
-        <w:pStyle w:val="NoSpacing"/>
-      </w:pPr>
-    </w:p>
-    <w:p>
-      <w:pPr>
-        <w:pStyle w:val="NoSpacing"/>
-      </w:pPr>
-      <w:r>
-        <w:t xml:space="preserve">1. Make the viewport resizable -- user can drag </w:t>
-      </w:r>
-    </w:p>
-    <w:p>
-      <w:pPr>
-        <w:pStyle w:val="NoSpacing"/>
-      </w:pPr>
-      <w:r>
-        <w:t xml:space="preserve">   the splitter between the input panel and 3D view </w:t>
-      </w:r>
-    </w:p>
-    <w:p>
-      <w:pPr>
-        <w:pStyle w:val="NoSpacing"/>
-      </w:pPr>
-      <w:r>
-        <w:t xml:space="preserve">   to make the 3D view larger or smaller</w:t>
-      </w:r>
-    </w:p>
-    <w:p>
-      <w:pPr>
-        <w:pStyle w:val="NoSpacing"/>
-      </w:pPr>
-    </w:p>
-    <w:p>
-      <w:pPr>
-        <w:pStyle w:val="NoSpacing"/>
-      </w:pPr>
-      <w:r>
-        <w:t>2. Add a toolbar above the 3D viewport with buttons:</w:t>
-      </w:r>
-    </w:p>
-    <w:p>
-      <w:pPr>
-        <w:pStyle w:val="NoSpacing"/>
-      </w:pPr>
-      <w:r>
-        <w:t xml:space="preserve">   - Reset View (return to default isometric angle)</w:t>
-      </w:r>
-    </w:p>
-    <w:p>
-      <w:pPr>
-        <w:pStyle w:val="NoSpacing"/>
-      </w:pPr>
-      <w:r>
-        <w:t xml:space="preserve">   - Top View (plan view from above)</w:t>
-      </w:r>
-    </w:p>
-    <w:p>
-      <w:pPr>
-        <w:pStyle w:val="NoSpacing"/>
-      </w:pPr>
-      <w:r>
-        <w:t xml:space="preserve">   - Side View (profile view from starboard)</w:t>
-      </w:r>
-    </w:p>
-    <w:p>
-      <w:pPr>
-        <w:pStyle w:val="NoSpacing"/>
-      </w:pPr>
-      <w:r>
-        <w:t xml:space="preserve">   - Front View (body plan view from bow)</w:t>
-      </w:r>
-    </w:p>
-    <w:p>
-      <w:pPr>
-        <w:pStyle w:val="NoSpacing"/>
-      </w:pPr>
-      <w:r>
-        <w:t xml:space="preserve">   - Fit to Screen (zoom to fit the hull)</w:t>
-      </w:r>
-    </w:p>
-    <w:p>
-      <w:pPr>
-        <w:pStyle w:val="NoSpacing"/>
-      </w:pPr>
-    </w:p>
-    <w:p>
-      <w:pPr>
-        <w:pStyle w:val="NoSpacing"/>
-      </w:pPr>
-      <w:r>
-        <w:t>3. Mouse controls (</w:t>
+        <w:t>……………………………………………………………………………………………………………………………………….</w:t>
+      </w:r>
+    </w:p>
+    <w:p>
+      <w:pPr>
+        <w:pStyle w:val="NoSpacing"/>
+      </w:pPr>
+      <w:r>
+        <w:t xml:space="preserve">Build the </w:t>
       </w:r>
       <w:proofErr w:type="spellStart"/>
       <w:r>
-        <w:t>HelixToolkit</w:t>
+        <w:t>Manoeuvring</w:t>
       </w:r>
       <w:proofErr w:type="spellEnd"/>
       <w:r>
-        <w:t xml:space="preserve"> defaults):</w:t>
-      </w:r>
-    </w:p>
-    <w:p>
-      <w:pPr>
-        <w:pStyle w:val="NoSpacing"/>
-      </w:pPr>
-      <w:r>
-        <w:t xml:space="preserve">   - Left click drag: rotate</w:t>
-      </w:r>
-    </w:p>
-    <w:p>
-      <w:pPr>
-        <w:pStyle w:val="NoSpacing"/>
-      </w:pPr>
-      <w:r>
-        <w:t xml:space="preserve">   - Right click drag: pan  </w:t>
-      </w:r>
-    </w:p>
-    <w:p>
-      <w:pPr>
-        <w:pStyle w:val="NoSpacing"/>
-      </w:pPr>
-      <w:r>
-        <w:t xml:space="preserve">   - Scroll wheel: zoom in and out</w:t>
-      </w:r>
-    </w:p>
-    <w:p>
-      <w:pPr>
-        <w:pStyle w:val="NoSpacing"/>
-      </w:pPr>
-    </w:p>
-    <w:p>
-      <w:pPr>
-        <w:pStyle w:val="NoSpacing"/>
-      </w:pPr>
-      <w:r>
-        <w:t xml:space="preserve">4. Add a small compass/axis indicator in the </w:t>
-      </w:r>
-    </w:p>
-    <w:p>
-      <w:pPr>
-        <w:pStyle w:val="NoSpacing"/>
-      </w:pPr>
-      <w:r>
-        <w:t xml:space="preserve">   bottom corner showing X Y Z orientation</w:t>
-      </w:r>
-    </w:p>
-    <w:p>
-      <w:pPr>
-        <w:pStyle w:val="NoSpacing"/>
-      </w:pPr>
+        <w:t xml:space="preserve"> module and Reports module.</w:t>
+      </w:r>
     </w:p>
     <w:p>
       <w:pPr>
@@ -175,276 +38,357 @@
       <w:pPr>
         <w:pStyle w:val="NoSpacing"/>
       </w:pPr>
-      <w:r>
-        <w:t xml:space="preserve">Build the </w:t>
+      <w:bookmarkStart w:id="0" w:name="_GoBack"/>
+      <w:bookmarkEnd w:id="0"/>
+    </w:p>
+    <w:p>
+      <w:pPr>
+        <w:pStyle w:val="NoSpacing"/>
+      </w:pPr>
+      <w:r>
+        <w:t>Create the following documentation files in the project folder:</w:t>
+      </w:r>
+    </w:p>
+    <w:p>
+      <w:pPr>
+        <w:pStyle w:val="NoSpacing"/>
+      </w:pPr>
+    </w:p>
+    <w:p>
+      <w:pPr>
+        <w:pStyle w:val="NoSpacing"/>
+      </w:pPr>
+      <w:r>
+        <w:t>1. README.txt</w:t>
+      </w:r>
+    </w:p>
+    <w:p>
+      <w:pPr>
+        <w:pStyle w:val="NoSpacing"/>
+      </w:pPr>
+      <w:r>
+        <w:t>- What the application does</w:t>
+      </w:r>
+    </w:p>
+    <w:p>
+      <w:pPr>
+        <w:pStyle w:val="NoSpacing"/>
+      </w:pPr>
+      <w:r>
+        <w:t>- System requirements (Windows 10/11, 64-bit)</w:t>
+      </w:r>
+    </w:p>
+    <w:p>
+      <w:pPr>
+        <w:pStyle w:val="NoSpacing"/>
+      </w:pPr>
+      <w:r>
+        <w:t>- How to install</w:t>
+      </w:r>
+    </w:p>
+    <w:p>
+      <w:pPr>
+        <w:pStyle w:val="NoSpacing"/>
+      </w:pPr>
+      <w:r>
+        <w:t>- How to uninstall</w:t>
+      </w:r>
+    </w:p>
+    <w:p>
+      <w:pPr>
+        <w:pStyle w:val="NoSpacing"/>
+      </w:pPr>
+      <w:r>
+        <w:t>- Known limitations of Version 1</w:t>
+      </w:r>
+    </w:p>
+    <w:p>
+      <w:pPr>
+        <w:pStyle w:val="NoSpacing"/>
+      </w:pPr>
+      <w:r>
+        <w:t xml:space="preserve">- Contact: Alper Alacam Naval Architecture, </w:t>
       </w:r>
       <w:proofErr w:type="spellStart"/>
       <w:r>
-        <w:t>Manoeuvring</w:t>
+        <w:t>Turkiye</w:t>
       </w:r>
       <w:proofErr w:type="spellEnd"/>
-      <w:r>
-        <w:t xml:space="preserve"> module and Reports module.</w:t>
-      </w:r>
-    </w:p>
-    <w:p>
-      <w:pPr>
-        <w:pStyle w:val="NoSpacing"/>
-      </w:pPr>
-      <w:r>
-        <w:t>……………………………………………………………………………………………………………………………………….</w:t>
-      </w:r>
-    </w:p>
-    <w:p>
-      <w:pPr>
-        <w:pStyle w:val="NoSpacing"/>
-      </w:pPr>
-    </w:p>
-    <w:p>
-      <w:pPr>
-        <w:pStyle w:val="NoSpacing"/>
-      </w:pPr>
-      <w:r>
-        <w:t>Create the following documentation files in the project folder:</w:t>
-      </w:r>
-    </w:p>
-    <w:p>
-      <w:pPr>
-        <w:pStyle w:val="NoSpacing"/>
-      </w:pPr>
-    </w:p>
-    <w:p>
-      <w:pPr>
-        <w:pStyle w:val="NoSpacing"/>
-      </w:pPr>
-      <w:r>
-        <w:t>1. README.txt</w:t>
-      </w:r>
-    </w:p>
-    <w:p>
-      <w:pPr>
-        <w:pStyle w:val="NoSpacing"/>
-      </w:pPr>
-      <w:r>
-        <w:t>- What the application does</w:t>
-      </w:r>
-    </w:p>
-    <w:p>
-      <w:pPr>
-        <w:pStyle w:val="NoSpacing"/>
-      </w:pPr>
-      <w:r>
-        <w:t>- System requirements (Windows 10/11, 64-bit)</w:t>
-      </w:r>
-    </w:p>
-    <w:p>
-      <w:pPr>
-        <w:pStyle w:val="NoSpacing"/>
-      </w:pPr>
-      <w:r>
-        <w:t>- How to install</w:t>
-      </w:r>
-    </w:p>
-    <w:p>
-      <w:pPr>
-        <w:pStyle w:val="NoSpacing"/>
-      </w:pPr>
-      <w:r>
-        <w:t>- How to uninstall</w:t>
-      </w:r>
-    </w:p>
-    <w:p>
-      <w:pPr>
-        <w:pStyle w:val="NoSpacing"/>
-      </w:pPr>
-      <w:r>
-        <w:t>- Known limitations of Version 1</w:t>
-      </w:r>
-    </w:p>
-    <w:p>
-      <w:pPr>
-        <w:pStyle w:val="NoSpacing"/>
-      </w:pPr>
-      <w:r>
-        <w:t xml:space="preserve">- Contact: Alper Alacam Naval Architecture, </w:t>
+    </w:p>
+    <w:p>
+      <w:pPr>
+        <w:pStyle w:val="NoSpacing"/>
+      </w:pPr>
+    </w:p>
+    <w:p>
+      <w:pPr>
+        <w:pStyle w:val="NoSpacing"/>
+      </w:pPr>
+      <w:r>
+        <w:t xml:space="preserve">2. HOWTO.txt  </w:t>
+      </w:r>
+    </w:p>
+    <w:p>
+      <w:pPr>
+        <w:pStyle w:val="NoSpacing"/>
+      </w:pPr>
+      <w:r>
+        <w:t>- How to use Ship Builder</w:t>
+      </w:r>
+    </w:p>
+    <w:p>
+      <w:pPr>
+        <w:pStyle w:val="NoSpacing"/>
+      </w:pPr>
+      <w:r>
+        <w:t>- How to use Hydrostatics module</w:t>
+      </w:r>
+    </w:p>
+    <w:p>
+      <w:pPr>
+        <w:pStyle w:val="NoSpacing"/>
+      </w:pPr>
+      <w:r>
+        <w:t>- How to use Resistance and Propulsion</w:t>
+      </w:r>
+    </w:p>
+    <w:p>
+      <w:pPr>
+        <w:pStyle w:val="NoSpacing"/>
+      </w:pPr>
+      <w:r>
+        <w:t>- How to use Machinery and EEDI checker</w:t>
+      </w:r>
+    </w:p>
+    <w:p>
+      <w:pPr>
+        <w:pStyle w:val="NoSpacing"/>
+      </w:pPr>
+      <w:r>
+        <w:t>- How to use Stability module</w:t>
+      </w:r>
+    </w:p>
+    <w:p>
+      <w:pPr>
+        <w:pStyle w:val="NoSpacing"/>
+      </w:pPr>
+      <w:r>
+        <w:t>- How to export a PDF report</w:t>
+      </w:r>
+    </w:p>
+    <w:p>
+      <w:pPr>
+        <w:pStyle w:val="NoSpacing"/>
+      </w:pPr>
+      <w:r>
+        <w:t>- How to interpret the results</w:t>
+      </w:r>
+    </w:p>
+    <w:p>
+      <w:pPr>
+        <w:pStyle w:val="NoSpacing"/>
+      </w:pPr>
+    </w:p>
+    <w:p>
+      <w:pPr>
+        <w:pStyle w:val="NoSpacing"/>
+      </w:pPr>
+      <w:r>
+        <w:t>3. LICENSE.txt</w:t>
+      </w:r>
+    </w:p>
+    <w:p>
+      <w:pPr>
+        <w:pStyle w:val="NoSpacing"/>
+      </w:pPr>
+      <w:r>
+        <w:t>- Free to use for educational and professional purposes</w:t>
+      </w:r>
+    </w:p>
+    <w:p>
+      <w:pPr>
+        <w:pStyle w:val="NoSpacing"/>
+      </w:pPr>
+      <w:r>
+        <w:t>- Not for resale</w:t>
+      </w:r>
+    </w:p>
+    <w:p>
+      <w:pPr>
+        <w:pStyle w:val="NoSpacing"/>
+      </w:pPr>
+      <w:r>
+        <w:t>- © 2026 Alper Alacam Naval Architecture</w:t>
+      </w:r>
+    </w:p>
+    <w:p>
+      <w:pPr>
+        <w:pStyle w:val="NoSpacing"/>
+      </w:pPr>
+    </w:p>
+    <w:p>
+      <w:pPr>
+        <w:pStyle w:val="NoSpacing"/>
+      </w:pPr>
+      <w:r>
+        <w:t>4. RELEASE_NOTES.txt</w:t>
+      </w:r>
+    </w:p>
+    <w:p>
+      <w:pPr>
+        <w:pStyle w:val="NoSpacing"/>
+      </w:pPr>
+      <w:r>
+        <w:t>- Version 1.0 -- July 2026</w:t>
+      </w:r>
+    </w:p>
+    <w:p>
+      <w:pPr>
+        <w:pStyle w:val="NoSpacing"/>
+      </w:pPr>
+      <w:r>
+        <w:t>- Modules included</w:t>
+      </w:r>
+    </w:p>
+    <w:p>
+      <w:pPr>
+        <w:pStyle w:val="NoSpacing"/>
+      </w:pPr>
+      <w:r>
+        <w:t>- Known limitations</w:t>
+      </w:r>
+    </w:p>
+    <w:p>
+      <w:pPr>
+        <w:pStyle w:val="NoSpacing"/>
+      </w:pPr>
+      <w:r>
+        <w:t>- What is coming in Version 2</w:t>
+      </w:r>
+    </w:p>
+    <w:p>
+      <w:pPr>
+        <w:pStyle w:val="NoSpacing"/>
+      </w:pPr>
+    </w:p>
+    <w:p>
+      <w:pPr>
+        <w:pStyle w:val="NoSpacing"/>
+      </w:pPr>
+      <w:r>
+        <w:t>……………………………………………………………………………………………………………………</w:t>
+      </w:r>
+    </w:p>
+    <w:p>
+      <w:pPr>
+        <w:pStyle w:val="NoSpacing"/>
+      </w:pPr>
+      <w:r>
+        <w:t xml:space="preserve">Then create an </w:t>
       </w:r>
       <w:proofErr w:type="spellStart"/>
       <w:r>
-        <w:t>Turkiye</w:t>
+        <w:t>Inno</w:t>
       </w:r>
       <w:proofErr w:type="spellEnd"/>
-    </w:p>
-    <w:p>
-      <w:pPr>
-        <w:pStyle w:val="NoSpacing"/>
-      </w:pPr>
-    </w:p>
-    <w:p>
-      <w:pPr>
-        <w:pStyle w:val="NoSpacing"/>
-      </w:pPr>
-      <w:r>
-        <w:t xml:space="preserve">2. HOWTO.txt  </w:t>
-      </w:r>
-    </w:p>
-    <w:p>
-      <w:pPr>
-        <w:pStyle w:val="NoSpacing"/>
-      </w:pPr>
-      <w:r>
-        <w:t>- How to use Ship Builder</w:t>
-      </w:r>
-    </w:p>
-    <w:p>
-      <w:pPr>
-        <w:pStyle w:val="NoSpacing"/>
-      </w:pPr>
-      <w:r>
-        <w:t>- How to use Hydrostatics module</w:t>
-      </w:r>
-    </w:p>
-    <w:p>
-      <w:pPr>
-        <w:pStyle w:val="NoSpacing"/>
-      </w:pPr>
-      <w:r>
-        <w:t>- How to use Resistance and Propulsion</w:t>
-      </w:r>
-    </w:p>
-    <w:p>
-      <w:pPr>
-        <w:pStyle w:val="NoSpacing"/>
-      </w:pPr>
-      <w:r>
-        <w:t>- How to use Machinery and EEDI checker</w:t>
-      </w:r>
-    </w:p>
-    <w:p>
-      <w:pPr>
-        <w:pStyle w:val="NoSpacing"/>
-      </w:pPr>
-      <w:r>
-        <w:t>- How to use Stability module</w:t>
-      </w:r>
-    </w:p>
-    <w:p>
-      <w:pPr>
-        <w:pStyle w:val="NoSpacing"/>
-      </w:pPr>
-      <w:r>
-        <w:t>- How to export a PDF report</w:t>
-      </w:r>
-    </w:p>
-    <w:p>
-      <w:pPr>
-        <w:pStyle w:val="NoSpacing"/>
-      </w:pPr>
-      <w:r>
-        <w:t>- How to interpret the results</w:t>
-      </w:r>
-    </w:p>
-    <w:p>
-      <w:pPr>
-        <w:pStyle w:val="NoSpacing"/>
-      </w:pPr>
-    </w:p>
-    <w:p>
-      <w:pPr>
-        <w:pStyle w:val="NoSpacing"/>
-      </w:pPr>
-      <w:r>
-        <w:t>3. LICENSE.txt</w:t>
-      </w:r>
-    </w:p>
-    <w:p>
-      <w:pPr>
-        <w:pStyle w:val="NoSpacing"/>
-      </w:pPr>
-      <w:r>
-        <w:t>- Free to use for educational and professional purposes</w:t>
-      </w:r>
-    </w:p>
-    <w:p>
-      <w:pPr>
-        <w:pStyle w:val="NoSpacing"/>
-      </w:pPr>
-      <w:r>
-        <w:t>- Not for resale</w:t>
-      </w:r>
-    </w:p>
-    <w:p>
-      <w:pPr>
-        <w:pStyle w:val="NoSpacing"/>
-      </w:pPr>
-      <w:r>
-        <w:t>- © 2026 Alper Alacam Naval Architecture</w:t>
-      </w:r>
-    </w:p>
-    <w:p>
-      <w:pPr>
-        <w:pStyle w:val="NoSpacing"/>
-      </w:pPr>
-    </w:p>
-    <w:p>
-      <w:pPr>
-        <w:pStyle w:val="NoSpacing"/>
-      </w:pPr>
-      <w:r>
-        <w:t>4. RELEASE_NOTES.txt</w:t>
-      </w:r>
-    </w:p>
-    <w:p>
-      <w:pPr>
-        <w:pStyle w:val="NoSpacing"/>
-      </w:pPr>
-      <w:r>
-        <w:t>- Version 1.0 -- July 2026</w:t>
-      </w:r>
-    </w:p>
-    <w:p>
-      <w:pPr>
-        <w:pStyle w:val="NoSpacing"/>
-      </w:pPr>
-      <w:r>
-        <w:t>- Modules included</w:t>
-      </w:r>
-    </w:p>
-    <w:p>
-      <w:pPr>
-        <w:pStyle w:val="NoSpacing"/>
-      </w:pPr>
-      <w:r>
-        <w:t>- Known limitations</w:t>
-      </w:r>
-    </w:p>
-    <w:p>
-      <w:pPr>
-        <w:pStyle w:val="NoSpacing"/>
-      </w:pPr>
-      <w:r>
-        <w:t>- What is coming in Version 2</w:t>
-      </w:r>
-    </w:p>
-    <w:p>
-      <w:pPr>
-        <w:pStyle w:val="NoSpacing"/>
-      </w:pPr>
-    </w:p>
-    <w:p>
-      <w:pPr>
-        <w:pStyle w:val="NoSpacing"/>
-      </w:pPr>
-      <w:r>
-        <w:t>……………………………………………………………………………………………………………………</w:t>
-      </w:r>
-    </w:p>
-    <w:p>
-      <w:pPr>
-        <w:pStyle w:val="NoSpacing"/>
-      </w:pPr>
-      <w:bookmarkStart w:id="0" w:name="_GoBack"/>
-      <w:r>
-        <w:t xml:space="preserve">Then create an </w:t>
+      <w:r>
+        <w:t xml:space="preserve"> Setup installer script that:</w:t>
+      </w:r>
+    </w:p>
+    <w:p>
+      <w:pPr>
+        <w:pStyle w:val="NoSpacing"/>
+      </w:pPr>
+    </w:p>
+    <w:p>
+      <w:pPr>
+        <w:pStyle w:val="NoSpacing"/>
+      </w:pPr>
+      <w:r>
+        <w:t>- Run `dotnet publish -r win-x64 --self-contained true -c Release -o C:\Temp\NavalArchitectureSuite\publish` first to produce the bundled output folder</w:t>
+      </w:r>
+    </w:p>
+    <w:p>
+      <w:pPr>
+        <w:pStyle w:val="NoSpacing"/>
+      </w:pPr>
+      <w:r>
+        <w:t>- Bundles the self-contained .NET 8 runtime</w:t>
+      </w:r>
+    </w:p>
+    <w:p>
+      <w:pPr>
+        <w:pStyle w:val="NoSpacing"/>
+      </w:pPr>
+      <w:r>
+        <w:t>- Registers in Windows Add/Remove Programs</w:t>
+      </w:r>
+    </w:p>
+    <w:p>
+      <w:pPr>
+        <w:pStyle w:val="NoSpacing"/>
+      </w:pPr>
+      <w:r>
+        <w:t>- Creates desktop and Start Menu shortcuts</w:t>
+      </w:r>
+    </w:p>
+    <w:p>
+      <w:pPr>
+        <w:pStyle w:val="NoSpacing"/>
+      </w:pPr>
+      <w:r>
+        <w:t>- Shows publisher as Alper Alacam Naval Architecture</w:t>
+      </w:r>
+    </w:p>
+    <w:p>
+      <w:pPr>
+        <w:pStyle w:val="NoSpacing"/>
+      </w:pPr>
+      <w:r>
+        <w:t>- Creates a proper uninstaller</w:t>
+      </w:r>
+    </w:p>
+    <w:p>
+      <w:pPr>
+        <w:pStyle w:val="NoSpacing"/>
+      </w:pPr>
+    </w:p>
+    <w:p>
+      <w:pPr>
+        <w:pStyle w:val="NoSpacing"/>
+      </w:pPr>
+      <w:r>
+        <w:t>Project is at C:\Temp\NavalArchitectureSuite.</w:t>
+      </w:r>
+    </w:p>
+    <w:p>
+      <w:pPr>
+        <w:pStyle w:val="NoSpacing"/>
+      </w:pPr>
+    </w:p>
+    <w:p>
+      <w:pPr>
+        <w:pStyle w:val="NoSpacing"/>
+      </w:pPr>
+      <w:r>
+        <w:t>When everything is complete, tell me:</w:t>
+      </w:r>
+    </w:p>
+    <w:p>
+      <w:pPr>
+        <w:pStyle w:val="NoSpacing"/>
+      </w:pPr>
+      <w:r>
+        <w:lastRenderedPageBreak/>
+        <w:t>1. The exact file path of the setup.exe to distribute</w:t>
+      </w:r>
+    </w:p>
+    <w:p>
+      <w:pPr>
+        <w:pStyle w:val="NoSpacing"/>
+      </w:pPr>
+      <w:r>
+        <w:t xml:space="preserve">2. The exact file path of the </w:t>
       </w:r>
       <w:proofErr w:type="spellStart"/>
       <w:r>
@@ -452,117 +396,14 @@
       </w:r>
       <w:proofErr w:type="spellEnd"/>
       <w:r>
-        <w:t xml:space="preserve"> Setup installer script that:</w:t>
-      </w:r>
-    </w:p>
-    <w:p>
-      <w:pPr>
-        <w:pStyle w:val="NoSpacing"/>
-      </w:pPr>
-    </w:p>
-    <w:p>
-      <w:pPr>
-        <w:pStyle w:val="NoSpacing"/>
-      </w:pPr>
-      <w:r>
-        <w:t>- Run `dotnet publish -r win-x64 --self-contained true -c Release -o C:\Temp\NavalArchitectureSuite\publish` first to produce the bundled output folder</w:t>
-      </w:r>
-    </w:p>
-    <w:p>
-      <w:pPr>
-        <w:pStyle w:val="NoSpacing"/>
-      </w:pPr>
-      <w:r>
-        <w:t>- Bundles the self-contained .NET 8 runtime</w:t>
-      </w:r>
-    </w:p>
-    <w:p>
-      <w:pPr>
-        <w:pStyle w:val="NoSpacing"/>
-      </w:pPr>
-      <w:r>
-        <w:t>- Registers in Windows Add/Remove Programs</w:t>
-      </w:r>
-    </w:p>
-    <w:p>
-      <w:pPr>
-        <w:pStyle w:val="NoSpacing"/>
-      </w:pPr>
-      <w:r>
-        <w:t>- Creates desktop and Start Menu shortcuts</w:t>
-      </w:r>
-    </w:p>
-    <w:p>
-      <w:pPr>
-        <w:pStyle w:val="NoSpacing"/>
-      </w:pPr>
-      <w:r>
-        <w:t>- Shows publisher as Alper Alacam Naval Architecture</w:t>
-      </w:r>
-    </w:p>
-    <w:p>
-      <w:pPr>
-        <w:pStyle w:val="NoSpacing"/>
-      </w:pPr>
-      <w:r>
-        <w:t>- Creates a proper uninstaller</w:t>
-      </w:r>
-    </w:p>
-    <w:p>
-      <w:pPr>
-        <w:pStyle w:val="NoSpacing"/>
-      </w:pPr>
-    </w:p>
-    <w:p>
-      <w:pPr>
-        <w:pStyle w:val="NoSpacing"/>
-      </w:pPr>
-      <w:r>
-        <w:t>Project is at C:\Temp\NavalArchitectureSuite.</w:t>
-      </w:r>
-    </w:p>
-    <w:p>
-      <w:pPr>
-        <w:pStyle w:val="NoSpacing"/>
-      </w:pPr>
-    </w:p>
-    <w:p>
-      <w:pPr>
-        <w:pStyle w:val="NoSpacing"/>
-      </w:pPr>
-      <w:r>
-        <w:t>When everything is complete, tell me:</w:t>
-      </w:r>
-    </w:p>
-    <w:p>
-      <w:pPr>
-        <w:pStyle w:val="NoSpacing"/>
-      </w:pPr>
-      <w:r>
-        <w:t>1. The exact file path of the setup.exe to distribute</w:t>
-      </w:r>
-    </w:p>
-    <w:p>
-      <w:pPr>
-        <w:pStyle w:val="NoSpacing"/>
-      </w:pPr>
-      <w:r>
-        <w:t xml:space="preserve">2. The exact file path of the </w:t>
+        <w:t xml:space="preserve"> Setup script (.</w:t>
       </w:r>
       <w:proofErr w:type="spellStart"/>
       <w:r>
-        <w:t>Inno</w:t>
+        <w:t>iss</w:t>
       </w:r>
       <w:proofErr w:type="spellEnd"/>
       <w:r>
-        <w:t xml:space="preserve"> Setup script (.</w:t>
-      </w:r>
-      <w:proofErr w:type="spellStart"/>
-      <w:r>
-        <w:t>iss</w:t>
-      </w:r>
-      <w:proofErr w:type="spellEnd"/>
-      <w:r>
         <w:t xml:space="preserve"> file)</w:t>
       </w:r>
     </w:p>
@@ -582,7 +423,6 @@
         <w:t>4. What to upload to share with users</w:t>
       </w:r>
     </w:p>
-    <w:bookmarkEnd w:id="0"/>
     <w:p>
       <w:pPr>
         <w:pStyle w:val="NoSpacing"/>

</xml_diff>

<commit_message>
feat: page numbers, label scaling, ComboBox picker fix, README/HOWTO/LICENSE/RELEASE_NOTES
</commit_message>
<xml_diff>
--- a/Improve the 3D hull viewport in Ship Builder.docx
+++ b/Improve the 3D hull viewport in Ship Builder.docx
@@ -6,285 +6,106 @@
       <w:pPr>
         <w:pStyle w:val="NoSpacing"/>
       </w:pPr>
-      <w:r>
-        <w:t>……………………………………………………………………………………………………………………………………….</w:t>
-      </w:r>
-    </w:p>
-    <w:p>
-      <w:pPr>
-        <w:pStyle w:val="NoSpacing"/>
-      </w:pPr>
-      <w:r>
-        <w:t xml:space="preserve">Build the </w:t>
-      </w:r>
-      <w:proofErr w:type="spellStart"/>
-      <w:r>
-        <w:t>Manoeuvring</w:t>
-      </w:r>
-      <w:proofErr w:type="spellEnd"/>
-      <w:r>
-        <w:t xml:space="preserve"> module and Reports module.</w:t>
-      </w:r>
-    </w:p>
-    <w:p>
-      <w:pPr>
-        <w:pStyle w:val="NoSpacing"/>
-      </w:pPr>
-      <w:r>
-        <w:t>……………………………………………………………………………………………………………………………………….</w:t>
-      </w:r>
-    </w:p>
-    <w:p>
-      <w:pPr>
-        <w:pStyle w:val="NoSpacing"/>
-      </w:pPr>
       <w:bookmarkStart w:id="0" w:name="_GoBack"/>
       <w:bookmarkEnd w:id="0"/>
-    </w:p>
-    <w:p>
-      <w:pPr>
-        <w:pStyle w:val="NoSpacing"/>
-      </w:pPr>
-      <w:r>
-        <w:t>Create the following documentation files in the project folder:</w:t>
-      </w:r>
-    </w:p>
-    <w:p>
-      <w:pPr>
-        <w:pStyle w:val="NoSpacing"/>
-      </w:pPr>
-    </w:p>
-    <w:p>
-      <w:pPr>
-        <w:pStyle w:val="NoSpacing"/>
-      </w:pPr>
-      <w:r>
-        <w:t>1. README.txt</w:t>
-      </w:r>
-    </w:p>
-    <w:p>
-      <w:pPr>
-        <w:pStyle w:val="NoSpacing"/>
-      </w:pPr>
-      <w:r>
-        <w:t>- What the application does</w:t>
-      </w:r>
-    </w:p>
-    <w:p>
-      <w:pPr>
-        <w:pStyle w:val="NoSpacing"/>
-      </w:pPr>
-      <w:r>
-        <w:t>- System requirements (Windows 10/11, 64-bit)</w:t>
-      </w:r>
-    </w:p>
-    <w:p>
-      <w:pPr>
-        <w:pStyle w:val="NoSpacing"/>
-      </w:pPr>
-      <w:r>
-        <w:t>- How to install</w:t>
-      </w:r>
-    </w:p>
-    <w:p>
-      <w:pPr>
-        <w:pStyle w:val="NoSpacing"/>
-      </w:pPr>
-      <w:r>
-        <w:t>- How to uninstall</w:t>
-      </w:r>
-    </w:p>
-    <w:p>
-      <w:pPr>
-        <w:pStyle w:val="NoSpacing"/>
-      </w:pPr>
-      <w:r>
-        <w:t>- Known limitations of Version 1</w:t>
-      </w:r>
-    </w:p>
-    <w:p>
-      <w:pPr>
-        <w:pStyle w:val="NoSpacing"/>
-      </w:pPr>
-      <w:r>
-        <w:t xml:space="preserve">- Contact: Alper Alacam Naval Architecture, </w:t>
+      <w:r>
+        <w:t xml:space="preserve">Then create an </w:t>
       </w:r>
       <w:proofErr w:type="spellStart"/>
       <w:r>
-        <w:t>Turkiye</w:t>
+        <w:t>Inno</w:t>
       </w:r>
       <w:proofErr w:type="spellEnd"/>
-    </w:p>
-    <w:p>
-      <w:pPr>
-        <w:pStyle w:val="NoSpacing"/>
-      </w:pPr>
-    </w:p>
-    <w:p>
-      <w:pPr>
-        <w:pStyle w:val="NoSpacing"/>
-      </w:pPr>
-      <w:r>
-        <w:t xml:space="preserve">2. HOWTO.txt  </w:t>
-      </w:r>
-    </w:p>
-    <w:p>
-      <w:pPr>
-        <w:pStyle w:val="NoSpacing"/>
-      </w:pPr>
-      <w:r>
-        <w:t>- How to use Ship Builder</w:t>
-      </w:r>
-    </w:p>
-    <w:p>
-      <w:pPr>
-        <w:pStyle w:val="NoSpacing"/>
-      </w:pPr>
-      <w:r>
-        <w:t>- How to use Hydrostatics module</w:t>
-      </w:r>
-    </w:p>
-    <w:p>
-      <w:pPr>
-        <w:pStyle w:val="NoSpacing"/>
-      </w:pPr>
-      <w:r>
-        <w:t>- How to use Resistance and Propulsion</w:t>
-      </w:r>
-    </w:p>
-    <w:p>
-      <w:pPr>
-        <w:pStyle w:val="NoSpacing"/>
-      </w:pPr>
-      <w:r>
-        <w:t>- How to use Machinery and EEDI checker</w:t>
-      </w:r>
-    </w:p>
-    <w:p>
-      <w:pPr>
-        <w:pStyle w:val="NoSpacing"/>
-      </w:pPr>
-      <w:r>
-        <w:t>- How to use Stability module</w:t>
-      </w:r>
-    </w:p>
-    <w:p>
-      <w:pPr>
-        <w:pStyle w:val="NoSpacing"/>
-      </w:pPr>
-      <w:r>
-        <w:t>- How to export a PDF report</w:t>
-      </w:r>
-    </w:p>
-    <w:p>
-      <w:pPr>
-        <w:pStyle w:val="NoSpacing"/>
-      </w:pPr>
-      <w:r>
-        <w:t>- How to interpret the results</w:t>
-      </w:r>
-    </w:p>
-    <w:p>
-      <w:pPr>
-        <w:pStyle w:val="NoSpacing"/>
-      </w:pPr>
-    </w:p>
-    <w:p>
-      <w:pPr>
-        <w:pStyle w:val="NoSpacing"/>
-      </w:pPr>
-      <w:r>
-        <w:t>3. LICENSE.txt</w:t>
-      </w:r>
-    </w:p>
-    <w:p>
-      <w:pPr>
-        <w:pStyle w:val="NoSpacing"/>
-      </w:pPr>
-      <w:r>
-        <w:t>- Free to use for educational and professional purposes</w:t>
-      </w:r>
-    </w:p>
-    <w:p>
-      <w:pPr>
-        <w:pStyle w:val="NoSpacing"/>
-      </w:pPr>
-      <w:r>
-        <w:t>- Not for resale</w:t>
-      </w:r>
-    </w:p>
-    <w:p>
-      <w:pPr>
-        <w:pStyle w:val="NoSpacing"/>
-      </w:pPr>
-      <w:r>
-        <w:t>- © 2026 Alper Alacam Naval Architecture</w:t>
-      </w:r>
-    </w:p>
-    <w:p>
-      <w:pPr>
-        <w:pStyle w:val="NoSpacing"/>
-      </w:pPr>
-    </w:p>
-    <w:p>
-      <w:pPr>
-        <w:pStyle w:val="NoSpacing"/>
-      </w:pPr>
-      <w:r>
-        <w:t>4. RELEASE_NOTES.txt</w:t>
-      </w:r>
-    </w:p>
-    <w:p>
-      <w:pPr>
-        <w:pStyle w:val="NoSpacing"/>
-      </w:pPr>
-      <w:r>
-        <w:t>- Version 1.0 -- July 2026</w:t>
-      </w:r>
-    </w:p>
-    <w:p>
-      <w:pPr>
-        <w:pStyle w:val="NoSpacing"/>
-      </w:pPr>
-      <w:r>
-        <w:t>- Modules included</w:t>
-      </w:r>
-    </w:p>
-    <w:p>
-      <w:pPr>
-        <w:pStyle w:val="NoSpacing"/>
-      </w:pPr>
-      <w:r>
-        <w:t>- Known limitations</w:t>
-      </w:r>
-    </w:p>
-    <w:p>
-      <w:pPr>
-        <w:pStyle w:val="NoSpacing"/>
-      </w:pPr>
-      <w:r>
-        <w:t>- What is coming in Version 2</w:t>
-      </w:r>
-    </w:p>
-    <w:p>
-      <w:pPr>
-        <w:pStyle w:val="NoSpacing"/>
-      </w:pPr>
-    </w:p>
-    <w:p>
-      <w:pPr>
-        <w:pStyle w:val="NoSpacing"/>
-      </w:pPr>
-      <w:r>
-        <w:t>……………………………………………………………………………………………………………………</w:t>
-      </w:r>
-    </w:p>
-    <w:p>
-      <w:pPr>
-        <w:pStyle w:val="NoSpacing"/>
-      </w:pPr>
-      <w:r>
-        <w:t xml:space="preserve">Then create an </w:t>
+      <w:r>
+        <w:t xml:space="preserve"> Setup installer script that:</w:t>
+      </w:r>
+    </w:p>
+    <w:p>
+      <w:pPr>
+        <w:pStyle w:val="NoSpacing"/>
+      </w:pPr>
+      <w:r>
+        <w:t xml:space="preserve">- Run `dotnet publish -r win-x64 --self-contained true -c Release -o </w:t>
+      </w:r>
+    </w:p>
+    <w:p>
+      <w:pPr>
+        <w:pStyle w:val="NoSpacing"/>
+      </w:pPr>
+      <w:r>
+        <w:t>C:\Temp\NavalArchitectureSuite\publish` first to produce the bundled output folder</w:t>
+      </w:r>
+    </w:p>
+    <w:p>
+      <w:pPr>
+        <w:pStyle w:val="NoSpacing"/>
+      </w:pPr>
+      <w:r>
+        <w:t>- Bundles the self-contained .NET 8 runtime</w:t>
+      </w:r>
+    </w:p>
+    <w:p>
+      <w:pPr>
+        <w:pStyle w:val="NoSpacing"/>
+      </w:pPr>
+      <w:r>
+        <w:t>- Registers in Windows Add/Remove Programs</w:t>
+      </w:r>
+    </w:p>
+    <w:p>
+      <w:pPr>
+        <w:pStyle w:val="NoSpacing"/>
+      </w:pPr>
+      <w:r>
+        <w:t>- Creates desktop and Start Menu shortcuts</w:t>
+      </w:r>
+    </w:p>
+    <w:p>
+      <w:pPr>
+        <w:pStyle w:val="NoSpacing"/>
+      </w:pPr>
+      <w:r>
+        <w:t>- Shows publisher as Alper Alacam Naval Architecture</w:t>
+      </w:r>
+    </w:p>
+    <w:p>
+      <w:pPr>
+        <w:pStyle w:val="NoSpacing"/>
+      </w:pPr>
+      <w:r>
+        <w:t>- Creates a proper uninstaller</w:t>
+      </w:r>
+    </w:p>
+    <w:p>
+      <w:pPr>
+        <w:pStyle w:val="NoSpacing"/>
+      </w:pPr>
+      <w:r>
+        <w:t>Project is at C:\Temp\NavalArchitectureSuite.</w:t>
+      </w:r>
+    </w:p>
+    <w:p>
+      <w:pPr>
+        <w:pStyle w:val="NoSpacing"/>
+      </w:pPr>
+      <w:r>
+        <w:t>When everything is complete, tell me:</w:t>
+      </w:r>
+    </w:p>
+    <w:p>
+      <w:pPr>
+        <w:pStyle w:val="NoSpacing"/>
+      </w:pPr>
+      <w:r>
+        <w:t>1. The exact file path of the setup.exe to distribute</w:t>
+      </w:r>
+    </w:p>
+    <w:p>
+      <w:pPr>
+        <w:pStyle w:val="NoSpacing"/>
+      </w:pPr>
+      <w:r>
+        <w:t xml:space="preserve">2. The exact file path of the </w:t>
       </w:r>
       <w:proofErr w:type="spellStart"/>
       <w:r>
@@ -292,118 +113,14 @@
       </w:r>
       <w:proofErr w:type="spellEnd"/>
       <w:r>
-        <w:t xml:space="preserve"> Setup installer script that:</w:t>
-      </w:r>
-    </w:p>
-    <w:p>
-      <w:pPr>
-        <w:pStyle w:val="NoSpacing"/>
-      </w:pPr>
-    </w:p>
-    <w:p>
-      <w:pPr>
-        <w:pStyle w:val="NoSpacing"/>
-      </w:pPr>
-      <w:r>
-        <w:t>- Run `dotnet publish -r win-x64 --self-contained true -c Release -o C:\Temp\NavalArchitectureSuite\publish` first to produce the bundled output folder</w:t>
-      </w:r>
-    </w:p>
-    <w:p>
-      <w:pPr>
-        <w:pStyle w:val="NoSpacing"/>
-      </w:pPr>
-      <w:r>
-        <w:t>- Bundles the self-contained .NET 8 runtime</w:t>
-      </w:r>
-    </w:p>
-    <w:p>
-      <w:pPr>
-        <w:pStyle w:val="NoSpacing"/>
-      </w:pPr>
-      <w:r>
-        <w:t>- Registers in Windows Add/Remove Programs</w:t>
-      </w:r>
-    </w:p>
-    <w:p>
-      <w:pPr>
-        <w:pStyle w:val="NoSpacing"/>
-      </w:pPr>
-      <w:r>
-        <w:t>- Creates desktop and Start Menu shortcuts</w:t>
-      </w:r>
-    </w:p>
-    <w:p>
-      <w:pPr>
-        <w:pStyle w:val="NoSpacing"/>
-      </w:pPr>
-      <w:r>
-        <w:t>- Shows publisher as Alper Alacam Naval Architecture</w:t>
-      </w:r>
-    </w:p>
-    <w:p>
-      <w:pPr>
-        <w:pStyle w:val="NoSpacing"/>
-      </w:pPr>
-      <w:r>
-        <w:t>- Creates a proper uninstaller</w:t>
-      </w:r>
-    </w:p>
-    <w:p>
-      <w:pPr>
-        <w:pStyle w:val="NoSpacing"/>
-      </w:pPr>
-    </w:p>
-    <w:p>
-      <w:pPr>
-        <w:pStyle w:val="NoSpacing"/>
-      </w:pPr>
-      <w:r>
-        <w:t>Project is at C:\Temp\NavalArchitectureSuite.</w:t>
-      </w:r>
-    </w:p>
-    <w:p>
-      <w:pPr>
-        <w:pStyle w:val="NoSpacing"/>
-      </w:pPr>
-    </w:p>
-    <w:p>
-      <w:pPr>
-        <w:pStyle w:val="NoSpacing"/>
-      </w:pPr>
-      <w:r>
-        <w:t>When everything is complete, tell me:</w:t>
-      </w:r>
-    </w:p>
-    <w:p>
-      <w:pPr>
-        <w:pStyle w:val="NoSpacing"/>
-      </w:pPr>
-      <w:r>
-        <w:lastRenderedPageBreak/>
-        <w:t>1. The exact file path of the setup.exe to distribute</w:t>
-      </w:r>
-    </w:p>
-    <w:p>
-      <w:pPr>
-        <w:pStyle w:val="NoSpacing"/>
-      </w:pPr>
-      <w:r>
-        <w:t xml:space="preserve">2. The exact file path of the </w:t>
+        <w:t xml:space="preserve"> Setup script (.</w:t>
       </w:r>
       <w:proofErr w:type="spellStart"/>
       <w:r>
-        <w:t>Inno</w:t>
+        <w:t>iss</w:t>
       </w:r>
       <w:proofErr w:type="spellEnd"/>
       <w:r>
-        <w:t xml:space="preserve"> Setup script (.</w:t>
-      </w:r>
-      <w:proofErr w:type="spellStart"/>
-      <w:r>
-        <w:t>iss</w:t>
-      </w:r>
-      <w:proofErr w:type="spellEnd"/>
-      <w:r>
         <w:t xml:space="preserve"> file)</w:t>
       </w:r>
     </w:p>
@@ -422,29 +139,6 @@
       <w:r>
         <w:t>4. What to upload to share with users</w:t>
       </w:r>
-    </w:p>
-    <w:p>
-      <w:pPr>
-        <w:pStyle w:val="NoSpacing"/>
-      </w:pPr>
-      <w:r>
-        <w:t>……………………………………………………………………………………………………………………………………………..</w:t>
-      </w:r>
-    </w:p>
-    <w:p>
-      <w:pPr>
-        <w:pStyle w:val="NoSpacing"/>
-      </w:pPr>
-    </w:p>
-    <w:p>
-      <w:pPr>
-        <w:pStyle w:val="NoSpacing"/>
-      </w:pPr>
-      <w:proofErr w:type="spellStart"/>
-      <w:r>
-        <w:t>NavalArchitectureSuite</w:t>
-      </w:r>
-      <w:proofErr w:type="spellEnd"/>
     </w:p>
     <w:sectPr>
       <w:pgSz w:w="12240" w:h="15840"/>

</xml_diff>